<commit_message>
Aplicar paleta vino de Carnes JC al prototipo y actualizar la figura del anteproyecto
Co-Authored-By: Claude Opus 5.5 <noreply@anthropic.com>
Claude-Session: https://claude.ai/code/session_01RUvjkKMe3TfaE298Q9HLba
</commit_message>
<xml_diff>
--- a/entrega/Anteproyecto_UbicaJC_CarnesJC.docx
+++ b/entrega/Anteproyecto_UbicaJC_CarnesJC.docx
@@ -2589,7 +2589,7 @@
       <w:r>
         <w:t xml:space="preserve">Un prototipo navegable con datos simulados ya muestra estos flujos, incluidas una ubicación fantasma y una caída de internet: </w:t>
       </w:r>
-      <w:hyperlink w:history="1" r:id="rIdxdqghzacynordsi8fii8z">
+      <w:hyperlink w:history="1" r:id="rIdpe5pdzzz6oha2r217jo8r">
         <w:r>
           <w:rPr>
             <w:color w:val="1F4E8C"/>
@@ -9123,7 +9123,7 @@
       <w:r>
         <w:t xml:space="preserve">Aires dos Santos, E. J. (2021). Caso DSV Vila do Conde (tesis de maestría, ISEP). </w:t>
       </w:r>
-      <w:hyperlink w:history="1" r:id="rIdcllo-qiahy3sgmtcd0_uq">
+      <w:hyperlink w:history="1" r:id="rIdselyxj13qdu14p5bebdkw">
         <w:r>
           <w:rPr>
             <w:color w:val="1F4E8C"/>
@@ -9155,7 +9155,7 @@
       <w:r>
         <w:t xml:space="preserve">, “Refrigerated-Facility Loads”, citado en </w:t>
       </w:r>
-      <w:hyperlink w:history="1" r:id="rIdddkf9z-awbf0fdhp6syy2">
+      <w:hyperlink w:history="1" r:id="rIdmo_kb_b_nrhhofh2oimfv">
         <w:r>
           <w:rPr>
             <w:color w:val="1F4E8C"/>
@@ -9180,7 +9180,7 @@
       <w:r>
         <w:t xml:space="preserve">Camcode y Zebra Technologies (fabricantes): </w:t>
       </w:r>
-      <w:hyperlink w:history="1" r:id="rIds1qfnyr4bib1-axphv5ko">
+      <w:hyperlink w:history="1" r:id="rIdks_a81ivpibjwcvkvetzr">
         <w:r>
           <w:rPr>
             <w:color w:val="1F4E8C"/>
@@ -9192,7 +9192,7 @@
       <w:r>
         <w:t xml:space="preserve">, </w:t>
       </w:r>
-      <w:hyperlink w:history="1" r:id="rIdhsyc83n34qngsj3knoepw">
+      <w:hyperlink w:history="1" r:id="rId0kkdkz0yadgtl37ipbzfp">
         <w:r>
           <w:rPr>
             <w:color w:val="1F4E8C"/>
@@ -9204,7 +9204,7 @@
       <w:r>
         <w:t xml:space="preserve">, </w:t>
       </w:r>
-      <w:hyperlink w:history="1" r:id="rIdjvoufgqgx17rpgr1ursxf">
+      <w:hyperlink w:history="1" r:id="rIdii2q7cbsp8wwriptm5wod">
         <w:r>
           <w:rPr>
             <w:color w:val="1F4E8C"/>
@@ -9216,7 +9216,7 @@
       <w:r>
         <w:t xml:space="preserve">, </w:t>
       </w:r>
-      <w:hyperlink w:history="1" r:id="rIdwwb2kkcqb5ka2zlulcthk">
+      <w:hyperlink w:history="1" r:id="rIdodoy_6ny27eyvzybz9stg">
         <w:r>
           <w:rPr>
             <w:color w:val="1F4E8C"/>
@@ -9228,7 +9228,7 @@
       <w:r>
         <w:t xml:space="preserve"> y </w:t>
       </w:r>
-      <w:hyperlink w:history="1" r:id="rIdpokrd9b3zksxurm_lc-ku">
+      <w:hyperlink w:history="1" r:id="rId0yzswtyu8hlu6q1p1atvg">
         <w:r>
           <w:rPr>
             <w:color w:val="1F4E8C"/>
@@ -9253,7 +9253,7 @@
       <w:r>
         <w:t xml:space="preserve">CFIA y USDA-FSIS: </w:t>
       </w:r>
-      <w:hyperlink w:history="1" r:id="rIdkapa1knlx4ptdhqk5hcjn">
+      <w:hyperlink w:history="1" r:id="rIddor3dwbytct4h5wec2bwv">
         <w:r>
           <w:rPr>
             <w:color w:val="1F4E8C"/>
@@ -9265,7 +9265,7 @@
       <w:r>
         <w:t xml:space="preserve"> y </w:t>
       </w:r>
-      <w:hyperlink w:history="1" r:id="rIdjjhjsiuzittuhpnyap24t">
+      <w:hyperlink w:history="1" r:id="rId4s4fdjd_bdq3odupnynjl">
         <w:r>
           <w:rPr>
             <w:color w:val="1F4E8C"/>
@@ -9290,7 +9290,7 @@
       <w:r>
         <w:t xml:space="preserve">Cleverence (cleverence.com): </w:t>
       </w:r>
-      <w:hyperlink w:history="1" r:id="rIdi3bduarteqj4bha-kyipi">
+      <w:hyperlink w:history="1" r:id="rId_dplxo-bagptio20qfmdc">
         <w:r>
           <w:rPr>
             <w:color w:val="1F4E8C"/>
@@ -9325,7 +9325,7 @@
       <w:r>
         <w:t xml:space="preserve">, 54(4), 627–641. </w:t>
       </w:r>
-      <w:hyperlink w:history="1" r:id="rIdfpyhzydpynix-uo4tx41v">
+      <w:hyperlink w:history="1" r:id="rIdqn5zfvgju2zql0f8z4pls">
         <w:r>
           <w:rPr>
             <w:color w:val="1F4E8C"/>
@@ -9347,7 +9347,7 @@
       <w:r>
         <w:t xml:space="preserve">GS1 (gs1.org): </w:t>
       </w:r>
-      <w:hyperlink w:history="1" r:id="rIdqs-moa5z-glvchm9h5adk">
+      <w:hyperlink w:history="1" r:id="rIdmrw4z7ot2lpbqllg-u8qu">
         <w:r>
           <w:rPr>
             <w:color w:val="1F4E8C"/>
@@ -9372,7 +9372,7 @@
       <w:r>
         <w:t xml:space="preserve">Laniel y Émond (2010). </w:t>
       </w:r>
-      <w:hyperlink w:history="1" r:id="rIddp0db36agpsmcd7opd80-">
+      <w:hyperlink w:history="1" r:id="rIdrvkdfmrkdc0x-gxa7h0lr">
         <w:r>
           <w:rPr>
             <w:color w:val="1F4E8C"/>
@@ -9397,7 +9397,7 @@
       <w:r>
         <w:t xml:space="preserve">Normatividad mexicana: </w:t>
       </w:r>
-      <w:hyperlink w:history="1" r:id="rId8e6oquog_l7uesermotgb">
+      <w:hyperlink w:history="1" r:id="rIdcih9fgtwkkbcg19wmo9uk">
         <w:r>
           <w:rPr>
             <w:color w:val="1F4E8C"/>
@@ -9409,7 +9409,7 @@
       <w:r>
         <w:t xml:space="preserve">, </w:t>
       </w:r>
-      <w:hyperlink w:history="1" r:id="rIdu3xlf32ifho2mw7ettdvt">
+      <w:hyperlink w:history="1" r:id="rIdtitskgv6osbbcjy0vrosq">
         <w:r>
           <w:rPr>
             <w:color w:val="1F4E8C"/>
@@ -9421,7 +9421,7 @@
       <w:r>
         <w:t xml:space="preserve">, </w:t>
       </w:r>
-      <w:hyperlink w:history="1" r:id="rIdja8q-cwlurt6_zapnkr45">
+      <w:hyperlink w:history="1" r:id="rIdnd-elerkd0kcy_3leftum">
         <w:r>
           <w:rPr>
             <w:color w:val="1F4E8C"/>
@@ -9433,7 +9433,7 @@
       <w:r>
         <w:t xml:space="preserve"> y </w:t>
       </w:r>
-      <w:hyperlink w:history="1" r:id="rIdgkdde-ijf8f1gfndii4qe">
+      <w:hyperlink w:history="1" r:id="rIdyfn7vwgxwp2tsfaeyy4dt">
         <w:r>
           <w:rPr>
             <w:color w:val="1F4E8C"/>
@@ -9458,7 +9458,7 @@
       <w:r>
         <w:t xml:space="preserve">Odoo S.A. Documentación de Odoo 19.0 y 20.0 (odoo.com/documentation): </w:t>
       </w:r>
-      <w:hyperlink w:history="1" r:id="rIda1wzxjdks3bp2bhb0i5it">
+      <w:hyperlink w:history="1" r:id="rIdetayapcxb5rlzoxpslhl2">
         <w:r>
           <w:rPr>
             <w:color w:val="1F4E8C"/>
@@ -9470,7 +9470,7 @@
       <w:r>
         <w:t xml:space="preserve">, </w:t>
       </w:r>
-      <w:hyperlink w:history="1" r:id="rIdvvvlwqasiwvzb7qt1amub">
+      <w:hyperlink w:history="1" r:id="rIdxlh7pyawwmpv79krpuq-e">
         <w:r>
           <w:rPr>
             <w:color w:val="1F4E8C"/>
@@ -9482,7 +9482,7 @@
       <w:r>
         <w:t xml:space="preserve">, </w:t>
       </w:r>
-      <w:hyperlink w:history="1" r:id="rId6ymlfvsmnimvxvxh4nwdv">
+      <w:hyperlink w:history="1" r:id="rId_2krftr5hh8bfsblhuaka">
         <w:r>
           <w:rPr>
             <w:color w:val="1F4E8C"/>
@@ -9494,7 +9494,7 @@
       <w:r>
         <w:t xml:space="preserve">, </w:t>
       </w:r>
-      <w:hyperlink w:history="1" r:id="rIdvzxmlc2tzool2tle18vwq">
+      <w:hyperlink w:history="1" r:id="rIdlllzeeku0ndp_qad0yr98">
         <w:r>
           <w:rPr>
             <w:color w:val="1F4E8C"/>
@@ -9506,7 +9506,7 @@
       <w:r>
         <w:t xml:space="preserve">, </w:t>
       </w:r>
-      <w:hyperlink w:history="1" r:id="rIdrvmpncytnhdnrpu9-8orm">
+      <w:hyperlink w:history="1" r:id="rIda10spo6j_w7k3dckobg2v">
         <w:r>
           <w:rPr>
             <w:color w:val="1F4E8C"/>
@@ -9518,7 +9518,7 @@
       <w:r>
         <w:t xml:space="preserve">, </w:t>
       </w:r>
-      <w:hyperlink w:history="1" r:id="rIdcd4cuto89yuigh6ajen9f">
+      <w:hyperlink w:history="1" r:id="rIdcaj9pf2s8pomootskq2hp">
         <w:r>
           <w:rPr>
             <w:color w:val="1F4E8C"/>
@@ -9530,7 +9530,7 @@
       <w:r>
         <w:t xml:space="preserve">, </w:t>
       </w:r>
-      <w:hyperlink w:history="1" r:id="rIdrtysmdlsobhngnnn6y0iq">
+      <w:hyperlink w:history="1" r:id="rIdru2r7kwk9zm0unkgwhmgh">
         <w:r>
           <w:rPr>
             <w:color w:val="1F4E8C"/>
@@ -9542,7 +9542,7 @@
       <w:r>
         <w:t xml:space="preserve"> y </w:t>
       </w:r>
-      <w:hyperlink w:history="1" r:id="rIdutw-vnabd2cmitfcxn5lx">
+      <w:hyperlink w:history="1" r:id="rIdftibq_mh2xob1kzzn7cgl">
         <w:r>
           <w:rPr>
             <w:color w:val="1F4E8C"/>
@@ -9567,7 +9567,7 @@
       <w:r>
         <w:t xml:space="preserve">Precios al 6 de octubre de 2026: Cyberpuerta (</w:t>
       </w:r>
-      <w:hyperlink w:history="1" r:id="rIdn-k5vahfswe0nlfywj655">
+      <w:hyperlink w:history="1" r:id="rIdds3meqmoyejgk9imlyis2">
         <w:r>
           <w:rPr>
             <w:color w:val="1F4E8C"/>
@@ -9579,7 +9579,7 @@
       <w:r>
         <w:t xml:space="preserve">, </w:t>
       </w:r>
-      <w:hyperlink w:history="1" r:id="rIdp6qun4gpknadl7ullk0am">
+      <w:hyperlink w:history="1" r:id="rIdpc8c2eswtcwuyivocnlmx">
         <w:r>
           <w:rPr>
             <w:color w:val="1F4E8C"/>
@@ -9591,7 +9591,7 @@
       <w:r>
         <w:t xml:space="preserve">, </w:t>
       </w:r>
-      <w:hyperlink w:history="1" r:id="rId3ywaf_1hgoovl-ky7sitg">
+      <w:hyperlink w:history="1" r:id="rId2wd7uijapf1qwq___z1vo">
         <w:r>
           <w:rPr>
             <w:color w:val="1F4E8C"/>
@@ -9603,7 +9603,7 @@
       <w:r>
         <w:t xml:space="preserve">), </w:t>
       </w:r>
-      <w:hyperlink w:history="1" r:id="rIdbzikellb2m8kzmxdxczbv">
+      <w:hyperlink w:history="1" r:id="rId1rja4bnvzqfs0pceyas1l">
         <w:r>
           <w:rPr>
             <w:color w:val="1F4E8C"/>
@@ -9615,7 +9615,7 @@
       <w:r>
         <w:t xml:space="preserve">, </w:t>
       </w:r>
-      <w:hyperlink w:history="1" r:id="rIdnnx3vbwrxme2dirsidcyi">
+      <w:hyperlink w:history="1" r:id="rIdd9ucsffnu7hj5inwi48xd">
         <w:r>
           <w:rPr>
             <w:color w:val="1F4E8C"/>
@@ -9627,7 +9627,7 @@
       <w:r>
         <w:t xml:space="preserve">, </w:t>
       </w:r>
-      <w:hyperlink w:history="1" r:id="rIdbfegyoew7yolvuleid62b">
+      <w:hyperlink w:history="1" r:id="rId4di7ny7abc2f9jpgaa9l_">
         <w:r>
           <w:rPr>
             <w:color w:val="1F4E8C"/>
@@ -9639,7 +9639,7 @@
       <w:r>
         <w:t xml:space="preserve">, </w:t>
       </w:r>
-      <w:hyperlink w:history="1" r:id="rIdexts9c-dhex5ceftbe52q">
+      <w:hyperlink w:history="1" r:id="rIdj6murtosbyrqkh9trzq4b">
         <w:r>
           <w:rPr>
             <w:color w:val="1F4E8C"/>
@@ -9651,7 +9651,7 @@
       <w:r>
         <w:t xml:space="preserve"> y </w:t>
       </w:r>
-      <w:hyperlink w:history="1" r:id="rId_9qktk1o_c5zenvh8_pzg">
+      <w:hyperlink w:history="1" r:id="rId-lknkss7bawd1kpz0hv49">
         <w:r>
           <w:rPr>
             <w:color w:val="1F4E8C"/>

</xml_diff>

<commit_message>
Usar el rojo de Carnes JC y su logotipo como referencia de la propuesta en el prototipo
Co-Authored-By: Claude Opus 5.5 <noreply@anthropic.com>
Claude-Session: https://claude.ai/code/session_01RUvjkKMe3TfaE298Q9HLba
</commit_message>
<xml_diff>
--- a/entrega/Anteproyecto_UbicaJC_CarnesJC.docx
+++ b/entrega/Anteproyecto_UbicaJC_CarnesJC.docx
@@ -2589,7 +2589,7 @@
       <w:r>
         <w:t xml:space="preserve">Un prototipo navegable con datos simulados ya muestra estos flujos, incluidas una ubicación fantasma y una caída de internet: </w:t>
       </w:r>
-      <w:hyperlink w:history="1" r:id="rIdpe5pdzzz6oha2r217jo8r">
+      <w:hyperlink w:history="1" r:id="rIdmguobfka2w8vuqouejmnc">
         <w:r>
           <w:rPr>
             <w:color w:val="1F4E8C"/>
@@ -9123,7 +9123,7 @@
       <w:r>
         <w:t xml:space="preserve">Aires dos Santos, E. J. (2021). Caso DSV Vila do Conde (tesis de maestría, ISEP). </w:t>
       </w:r>
-      <w:hyperlink w:history="1" r:id="rIdselyxj13qdu14p5bebdkw">
+      <w:hyperlink w:history="1" r:id="rIdok3rwgqcan0ni84sjpleg">
         <w:r>
           <w:rPr>
             <w:color w:val="1F4E8C"/>
@@ -9155,7 +9155,7 @@
       <w:r>
         <w:t xml:space="preserve">, “Refrigerated-Facility Loads”, citado en </w:t>
       </w:r>
-      <w:hyperlink w:history="1" r:id="rIdmo_kb_b_nrhhofh2oimfv">
+      <w:hyperlink w:history="1" r:id="rId9ufterbwi6br5hgd-uv7p">
         <w:r>
           <w:rPr>
             <w:color w:val="1F4E8C"/>
@@ -9180,7 +9180,7 @@
       <w:r>
         <w:t xml:space="preserve">Camcode y Zebra Technologies (fabricantes): </w:t>
       </w:r>
-      <w:hyperlink w:history="1" r:id="rIdks_a81ivpibjwcvkvetzr">
+      <w:hyperlink w:history="1" r:id="rIdwgo5pt8vxacngdixyb5lf">
         <w:r>
           <w:rPr>
             <w:color w:val="1F4E8C"/>
@@ -9192,7 +9192,7 @@
       <w:r>
         <w:t xml:space="preserve">, </w:t>
       </w:r>
-      <w:hyperlink w:history="1" r:id="rId0kkdkz0yadgtl37ipbzfp">
+      <w:hyperlink w:history="1" r:id="rIdvsjuaqmon6pzw8fwbzok8">
         <w:r>
           <w:rPr>
             <w:color w:val="1F4E8C"/>
@@ -9204,7 +9204,7 @@
       <w:r>
         <w:t xml:space="preserve">, </w:t>
       </w:r>
-      <w:hyperlink w:history="1" r:id="rIdii2q7cbsp8wwriptm5wod">
+      <w:hyperlink w:history="1" r:id="rIdzuasfcacjbykv7pwsh-mq">
         <w:r>
           <w:rPr>
             <w:color w:val="1F4E8C"/>
@@ -9216,7 +9216,7 @@
       <w:r>
         <w:t xml:space="preserve">, </w:t>
       </w:r>
-      <w:hyperlink w:history="1" r:id="rIdodoy_6ny27eyvzybz9stg">
+      <w:hyperlink w:history="1" r:id="rIduverqdlvnsesgt-fqyxmv">
         <w:r>
           <w:rPr>
             <w:color w:val="1F4E8C"/>
@@ -9228,7 +9228,7 @@
       <w:r>
         <w:t xml:space="preserve"> y </w:t>
       </w:r>
-      <w:hyperlink w:history="1" r:id="rId0yzswtyu8hlu6q1p1atvg">
+      <w:hyperlink w:history="1" r:id="rId2kerif3le-64i7wykjzyz">
         <w:r>
           <w:rPr>
             <w:color w:val="1F4E8C"/>
@@ -9253,7 +9253,7 @@
       <w:r>
         <w:t xml:space="preserve">CFIA y USDA-FSIS: </w:t>
       </w:r>
-      <w:hyperlink w:history="1" r:id="rIddor3dwbytct4h5wec2bwv">
+      <w:hyperlink w:history="1" r:id="rIdinsuszwwguunvn0smffhf">
         <w:r>
           <w:rPr>
             <w:color w:val="1F4E8C"/>
@@ -9265,7 +9265,7 @@
       <w:r>
         <w:t xml:space="preserve"> y </w:t>
       </w:r>
-      <w:hyperlink w:history="1" r:id="rId4s4fdjd_bdq3odupnynjl">
+      <w:hyperlink w:history="1" r:id="rId3idplb5v_65wv3dibfgfw">
         <w:r>
           <w:rPr>
             <w:color w:val="1F4E8C"/>
@@ -9290,7 +9290,7 @@
       <w:r>
         <w:t xml:space="preserve">Cleverence (cleverence.com): </w:t>
       </w:r>
-      <w:hyperlink w:history="1" r:id="rId_dplxo-bagptio20qfmdc">
+      <w:hyperlink w:history="1" r:id="rId94meax5rwue5h5jf2jsdz">
         <w:r>
           <w:rPr>
             <w:color w:val="1F4E8C"/>
@@ -9325,7 +9325,7 @@
       <w:r>
         <w:t xml:space="preserve">, 54(4), 627–641. </w:t>
       </w:r>
-      <w:hyperlink w:history="1" r:id="rIdqn5zfvgju2zql0f8z4pls">
+      <w:hyperlink w:history="1" r:id="rId2bastcfweueczsndj5njf">
         <w:r>
           <w:rPr>
             <w:color w:val="1F4E8C"/>
@@ -9347,7 +9347,7 @@
       <w:r>
         <w:t xml:space="preserve">GS1 (gs1.org): </w:t>
       </w:r>
-      <w:hyperlink w:history="1" r:id="rIdmrw4z7ot2lpbqllg-u8qu">
+      <w:hyperlink w:history="1" r:id="rIdrnfs7sao0mggmdymsgsmx">
         <w:r>
           <w:rPr>
             <w:color w:val="1F4E8C"/>
@@ -9372,7 +9372,7 @@
       <w:r>
         <w:t xml:space="preserve">Laniel y Émond (2010). </w:t>
       </w:r>
-      <w:hyperlink w:history="1" r:id="rIdrvkdfmrkdc0x-gxa7h0lr">
+      <w:hyperlink w:history="1" r:id="rIdis7ejumfwinvgvu1opczg">
         <w:r>
           <w:rPr>
             <w:color w:val="1F4E8C"/>
@@ -9397,7 +9397,7 @@
       <w:r>
         <w:t xml:space="preserve">Normatividad mexicana: </w:t>
       </w:r>
-      <w:hyperlink w:history="1" r:id="rIdcih9fgtwkkbcg19wmo9uk">
+      <w:hyperlink w:history="1" r:id="rIdh5eakusiln0ueh8pwf0hj">
         <w:r>
           <w:rPr>
             <w:color w:val="1F4E8C"/>
@@ -9409,7 +9409,7 @@
       <w:r>
         <w:t xml:space="preserve">, </w:t>
       </w:r>
-      <w:hyperlink w:history="1" r:id="rIdtitskgv6osbbcjy0vrosq">
+      <w:hyperlink w:history="1" r:id="rId1ktlkm8jzq4qh6ylsboe_">
         <w:r>
           <w:rPr>
             <w:color w:val="1F4E8C"/>
@@ -9421,7 +9421,7 @@
       <w:r>
         <w:t xml:space="preserve">, </w:t>
       </w:r>
-      <w:hyperlink w:history="1" r:id="rIdnd-elerkd0kcy_3leftum">
+      <w:hyperlink w:history="1" r:id="rId32fm0lm5sb3dufd80cclp">
         <w:r>
           <w:rPr>
             <w:color w:val="1F4E8C"/>
@@ -9433,7 +9433,7 @@
       <w:r>
         <w:t xml:space="preserve"> y </w:t>
       </w:r>
-      <w:hyperlink w:history="1" r:id="rIdyfn7vwgxwp2tsfaeyy4dt">
+      <w:hyperlink w:history="1" r:id="rIdxa6hmgs-v8cvusxdhurub">
         <w:r>
           <w:rPr>
             <w:color w:val="1F4E8C"/>
@@ -9458,7 +9458,7 @@
       <w:r>
         <w:t xml:space="preserve">Odoo S.A. Documentación de Odoo 19.0 y 20.0 (odoo.com/documentation): </w:t>
       </w:r>
-      <w:hyperlink w:history="1" r:id="rIdetayapcxb5rlzoxpslhl2">
+      <w:hyperlink w:history="1" r:id="rIdoa3sdeagyxitexcyc3v2h">
         <w:r>
           <w:rPr>
             <w:color w:val="1F4E8C"/>
@@ -9470,7 +9470,7 @@
       <w:r>
         <w:t xml:space="preserve">, </w:t>
       </w:r>
-      <w:hyperlink w:history="1" r:id="rIdxlh7pyawwmpv79krpuq-e">
+      <w:hyperlink w:history="1" r:id="rId4bvud1zo4pbrjh9uabozv">
         <w:r>
           <w:rPr>
             <w:color w:val="1F4E8C"/>
@@ -9482,7 +9482,7 @@
       <w:r>
         <w:t xml:space="preserve">, </w:t>
       </w:r>
-      <w:hyperlink w:history="1" r:id="rId_2krftr5hh8bfsblhuaka">
+      <w:hyperlink w:history="1" r:id="rIdo1pm4lf-jenk1gcbugiwq">
         <w:r>
           <w:rPr>
             <w:color w:val="1F4E8C"/>
@@ -9494,7 +9494,7 @@
       <w:r>
         <w:t xml:space="preserve">, </w:t>
       </w:r>
-      <w:hyperlink w:history="1" r:id="rIdlllzeeku0ndp_qad0yr98">
+      <w:hyperlink w:history="1" r:id="rIdwv2j_wxkmstlquvuzptfq">
         <w:r>
           <w:rPr>
             <w:color w:val="1F4E8C"/>
@@ -9506,7 +9506,7 @@
       <w:r>
         <w:t xml:space="preserve">, </w:t>
       </w:r>
-      <w:hyperlink w:history="1" r:id="rIda10spo6j_w7k3dckobg2v">
+      <w:hyperlink w:history="1" r:id="rIdfui5dha8agkyifjbl9fvw">
         <w:r>
           <w:rPr>
             <w:color w:val="1F4E8C"/>
@@ -9518,7 +9518,7 @@
       <w:r>
         <w:t xml:space="preserve">, </w:t>
       </w:r>
-      <w:hyperlink w:history="1" r:id="rIdcaj9pf2s8pomootskq2hp">
+      <w:hyperlink w:history="1" r:id="rIdn7w6glt3spxpnihy0dzv8">
         <w:r>
           <w:rPr>
             <w:color w:val="1F4E8C"/>
@@ -9530,7 +9530,7 @@
       <w:r>
         <w:t xml:space="preserve">, </w:t>
       </w:r>
-      <w:hyperlink w:history="1" r:id="rIdru2r7kwk9zm0unkgwhmgh">
+      <w:hyperlink w:history="1" r:id="rId5cy5xzuolrde5e3cl4ijd">
         <w:r>
           <w:rPr>
             <w:color w:val="1F4E8C"/>
@@ -9542,7 +9542,7 @@
       <w:r>
         <w:t xml:space="preserve"> y </w:t>
       </w:r>
-      <w:hyperlink w:history="1" r:id="rIdftibq_mh2xob1kzzn7cgl">
+      <w:hyperlink w:history="1" r:id="rIdbx1od4ulfrlfg6ortm9hp">
         <w:r>
           <w:rPr>
             <w:color w:val="1F4E8C"/>
@@ -9567,7 +9567,7 @@
       <w:r>
         <w:t xml:space="preserve">Precios al 6 de octubre de 2026: Cyberpuerta (</w:t>
       </w:r>
-      <w:hyperlink w:history="1" r:id="rIdds3meqmoyejgk9imlyis2">
+      <w:hyperlink w:history="1" r:id="rIdi6pd1bfvzlsr563ravs5e">
         <w:r>
           <w:rPr>
             <w:color w:val="1F4E8C"/>
@@ -9579,7 +9579,7 @@
       <w:r>
         <w:t xml:space="preserve">, </w:t>
       </w:r>
-      <w:hyperlink w:history="1" r:id="rIdpc8c2eswtcwuyivocnlmx">
+      <w:hyperlink w:history="1" r:id="rId1zgymd-rqf9k69wqjchsq">
         <w:r>
           <w:rPr>
             <w:color w:val="1F4E8C"/>
@@ -9591,7 +9591,7 @@
       <w:r>
         <w:t xml:space="preserve">, </w:t>
       </w:r>
-      <w:hyperlink w:history="1" r:id="rId2wd7uijapf1qwq___z1vo">
+      <w:hyperlink w:history="1" r:id="rId4cqywksed1qgdq3xkw86h">
         <w:r>
           <w:rPr>
             <w:color w:val="1F4E8C"/>
@@ -9603,7 +9603,7 @@
       <w:r>
         <w:t xml:space="preserve">), </w:t>
       </w:r>
-      <w:hyperlink w:history="1" r:id="rId1rja4bnvzqfs0pceyas1l">
+      <w:hyperlink w:history="1" r:id="rIdgq-qtty93rk0gnbdrv9nd">
         <w:r>
           <w:rPr>
             <w:color w:val="1F4E8C"/>
@@ -9615,7 +9615,7 @@
       <w:r>
         <w:t xml:space="preserve">, </w:t>
       </w:r>
-      <w:hyperlink w:history="1" r:id="rIdd9ucsffnu7hj5inwi48xd">
+      <w:hyperlink w:history="1" r:id="rIdwrz-jmhycpq1j7l61xttl">
         <w:r>
           <w:rPr>
             <w:color w:val="1F4E8C"/>
@@ -9627,7 +9627,7 @@
       <w:r>
         <w:t xml:space="preserve">, </w:t>
       </w:r>
-      <w:hyperlink w:history="1" r:id="rId4di7ny7abc2f9jpgaa9l_">
+      <w:hyperlink w:history="1" r:id="rId6g3haaaka_a5cuwkgk5xc">
         <w:r>
           <w:rPr>
             <w:color w:val="1F4E8C"/>
@@ -9639,7 +9639,7 @@
       <w:r>
         <w:t xml:space="preserve">, </w:t>
       </w:r>
-      <w:hyperlink w:history="1" r:id="rIdj6murtosbyrqkh9trzq4b">
+      <w:hyperlink w:history="1" r:id="rIdq7fz6brwkczeoyhdzbo9r">
         <w:r>
           <w:rPr>
             <w:color w:val="1F4E8C"/>
@@ -9651,7 +9651,7 @@
       <w:r>
         <w:t xml:space="preserve"> y </w:t>
       </w:r>
-      <w:hyperlink w:history="1" r:id="rId-lknkss7bawd1kpz0hv49">
+      <w:hyperlink w:history="1" r:id="rIdwlb-vilswcp0birlmoo2e">
         <w:r>
           <w:rPr>
             <w:color w:val="1F4E8C"/>

</xml_diff>